<commit_message>
Added top copper gnd layer on pre amp
</commit_message>
<xml_diff>
--- a/Board reviews/Power Amp Stage.docx
+++ b/Board reviews/Power Amp Stage.docx
@@ -92,8 +92,128 @@
         <w:t>?</w:t>
       </w:r>
     </w:p>
+    <w:p>
+      <w:pPr>
+        <w:rPr>
+          <w:rFonts w:ascii="Times New Roman" w:hAnsi="Times New Roman" w:cs="Times New Roman"/>
+        </w:rPr>
+      </w:pPr>
+    </w:p>
+    <w:p>
+      <w:pPr>
+        <w:rPr>
+          <w:rFonts w:ascii="Times New Roman" w:hAnsi="Times New Roman" w:cs="Times New Roman"/>
+        </w:rPr>
+      </w:pPr>
+      <w:r>
+        <w:rPr>
+          <w:rFonts w:ascii="Times New Roman" w:hAnsi="Times New Roman" w:cs="Times New Roman"/>
+        </w:rPr>
+        <w:drawing>
+          <wp:inline distT="0" distB="0" distL="0" distR="0" wp14:anchorId="33EAF345" wp14:editId="57A4AA3C">
+            <wp:extent cx="4037162" cy="2612510"/>
+            <wp:effectExtent l="0" t="0" r="1905" b="0"/>
+            <wp:docPr id="1169104825" name="Picture 1"/>
+            <wp:cNvGraphicFramePr>
+              <a:graphicFrameLocks xmlns:a="http://schemas.openxmlformats.org/drawingml/2006/main" noChangeAspect="1"/>
+            </wp:cNvGraphicFramePr>
+            <a:graphic xmlns:a="http://schemas.openxmlformats.org/drawingml/2006/main">
+              <a:graphicData uri="http://schemas.openxmlformats.org/drawingml/2006/picture">
+                <pic:pic xmlns:pic="http://schemas.openxmlformats.org/drawingml/2006/picture">
+                  <pic:nvPicPr>
+                    <pic:cNvPr id="1169104825" name=""/>
+                    <pic:cNvPicPr/>
+                  </pic:nvPicPr>
+                  <pic:blipFill>
+                    <a:blip r:embed="rId7"/>
+                    <a:stretch>
+                      <a:fillRect/>
+                    </a:stretch>
+                  </pic:blipFill>
+                  <pic:spPr>
+                    <a:xfrm>
+                      <a:off x="0" y="0"/>
+                      <a:ext cx="4039143" cy="2613792"/>
+                    </a:xfrm>
+                    <a:prstGeom prst="rect">
+                      <a:avLst/>
+                    </a:prstGeom>
+                  </pic:spPr>
+                </pic:pic>
+              </a:graphicData>
+            </a:graphic>
+          </wp:inline>
+        </w:drawing>
+      </w:r>
+    </w:p>
+    <w:p>
+      <w:pPr>
+        <w:rPr>
+          <w:rFonts w:ascii="Times New Roman" w:hAnsi="Times New Roman" w:cs="Times New Roman"/>
+        </w:rPr>
+      </w:pPr>
+      <w:r>
+        <w:rPr>
+          <w:rFonts w:ascii="Times New Roman" w:hAnsi="Times New Roman" w:cs="Times New Roman"/>
+        </w:rPr>
+        <w:t>Ground should be bottom pins. Pins 1 and 2 on the left and Pin 1 on the right should be GND</w:t>
+      </w:r>
+    </w:p>
+    <w:p>
+      <w:pPr>
+        <w:rPr>
+          <w:rFonts w:ascii="Times New Roman" w:hAnsi="Times New Roman" w:cs="Times New Roman"/>
+        </w:rPr>
+      </w:pPr>
+      <w:r>
+        <w:rPr>
+          <w:rFonts w:ascii="Times New Roman" w:hAnsi="Times New Roman" w:cs="Times New Roman"/>
+        </w:rPr>
+        <w:drawing>
+          <wp:inline distT="0" distB="0" distL="0" distR="0" wp14:anchorId="6F324F93" wp14:editId="687F4D0C">
+            <wp:extent cx="1802921" cy="1702360"/>
+            <wp:effectExtent l="0" t="0" r="6985" b="0"/>
+            <wp:docPr id="1755337955" name="Picture 1"/>
+            <wp:cNvGraphicFramePr>
+              <a:graphicFrameLocks xmlns:a="http://schemas.openxmlformats.org/drawingml/2006/main" noChangeAspect="1"/>
+            </wp:cNvGraphicFramePr>
+            <a:graphic xmlns:a="http://schemas.openxmlformats.org/drawingml/2006/main">
+              <a:graphicData uri="http://schemas.openxmlformats.org/drawingml/2006/picture">
+                <pic:pic xmlns:pic="http://schemas.openxmlformats.org/drawingml/2006/picture">
+                  <pic:nvPicPr>
+                    <pic:cNvPr id="1755337955" name=""/>
+                    <pic:cNvPicPr/>
+                  </pic:nvPicPr>
+                  <pic:blipFill>
+                    <a:blip r:embed="rId8"/>
+                    <a:stretch>
+                      <a:fillRect/>
+                    </a:stretch>
+                  </pic:blipFill>
+                  <pic:spPr>
+                    <a:xfrm>
+                      <a:off x="0" y="0"/>
+                      <a:ext cx="1806546" cy="1705783"/>
+                    </a:xfrm>
+                    <a:prstGeom prst="rect">
+                      <a:avLst/>
+                    </a:prstGeom>
+                  </pic:spPr>
+                </pic:pic>
+              </a:graphicData>
+            </a:graphic>
+          </wp:inline>
+        </w:drawing>
+      </w:r>
+      <w:r>
+        <w:rPr>
+          <w:rFonts w:ascii="Times New Roman" w:hAnsi="Times New Roman" w:cs="Times New Roman"/>
+        </w:rPr>
+        <w:t xml:space="preserve"> Same here</w:t>
+      </w:r>
+    </w:p>
     <w:sectPr>
-      <w:headerReference w:type="default" r:id="rId7"/>
+      <w:headerReference w:type="default" r:id="rId9"/>
       <w:pgSz w:w="12240" w:h="15840"/>
       <w:pgMar w:top="1440" w:right="1440" w:bottom="1440" w:left="1440" w:header="720" w:footer="720" w:gutter="0"/>
       <w:cols w:space="720"/>

</xml_diff>

<commit_message>
new review for power amp
</commit_message>
<xml_diff>
--- a/Board reviews/Power Amp Stage.docx
+++ b/Board reviews/Power Amp Stage.docx
@@ -349,6 +349,7 @@
       <w:r>
         <w:rPr>
           <w:rFonts w:ascii="Times New Roman" w:hAnsi="Times New Roman" w:cs="Times New Roman"/>
+          <w:noProof/>
         </w:rPr>
         <w:drawing>
           <wp:inline distT="0" distB="0" distL="0" distR="0" wp14:anchorId="3599B279" wp14:editId="3B7CD531">
@@ -428,6 +429,7 @@
       <w:r>
         <w:rPr>
           <w:rFonts w:ascii="Times New Roman" w:hAnsi="Times New Roman" w:cs="Times New Roman"/>
+          <w:noProof/>
         </w:rPr>
         <w:drawing>
           <wp:inline distT="0" distB="0" distL="0" distR="0" wp14:anchorId="4F197A8E" wp14:editId="0044E39B">
@@ -497,199 +499,6 @@
       <w:pPr>
         <w:rPr>
           <w:rFonts w:ascii="Times New Roman" w:hAnsi="Times New Roman" w:cs="Times New Roman"/>
-          <w:b/>
-          <w:bCs/>
-          <w:color w:val="EE0000"/>
-          <w:sz w:val="32"/>
-          <w:szCs w:val="32"/>
-        </w:rPr>
-      </w:pPr>
-      <w:r>
-        <w:rPr>
-          <w:rFonts w:ascii="Times New Roman" w:hAnsi="Times New Roman" w:cs="Times New Roman"/>
-          <w:b/>
-          <w:bCs/>
-          <w:color w:val="EE0000"/>
-          <w:sz w:val="32"/>
-          <w:szCs w:val="32"/>
-        </w:rPr>
-        <w:lastRenderedPageBreak/>
-        <w:t>Change this!</w:t>
-      </w:r>
-    </w:p>
-    <w:p>
-      <w:pPr>
-        <w:rPr>
-          <w:rFonts w:ascii="Times New Roman" w:hAnsi="Times New Roman" w:cs="Times New Roman"/>
-        </w:rPr>
-      </w:pPr>
-      <w:r>
-        <w:rPr>
-          <w:rFonts w:ascii="Times New Roman" w:hAnsi="Times New Roman" w:cs="Times New Roman"/>
-        </w:rPr>
-        <w:drawing>
-          <wp:inline distT="0" distB="0" distL="0" distR="0" wp14:anchorId="59084BFC" wp14:editId="2478661C">
-            <wp:extent cx="3624146" cy="2571750"/>
-            <wp:effectExtent l="0" t="0" r="0" b="0"/>
-            <wp:docPr id="1287014834" name="Picture 1"/>
-            <wp:cNvGraphicFramePr>
-              <a:graphicFrameLocks xmlns:a="http://schemas.openxmlformats.org/drawingml/2006/main" noChangeAspect="1"/>
-            </wp:cNvGraphicFramePr>
-            <a:graphic xmlns:a="http://schemas.openxmlformats.org/drawingml/2006/main">
-              <a:graphicData uri="http://schemas.openxmlformats.org/drawingml/2006/picture">
-                <pic:pic xmlns:pic="http://schemas.openxmlformats.org/drawingml/2006/picture">
-                  <pic:nvPicPr>
-                    <pic:cNvPr id="1287014834" name=""/>
-                    <pic:cNvPicPr/>
-                  </pic:nvPicPr>
-                  <pic:blipFill>
-                    <a:blip r:embed="rId15"/>
-                    <a:stretch>
-                      <a:fillRect/>
-                    </a:stretch>
-                  </pic:blipFill>
-                  <pic:spPr>
-                    <a:xfrm>
-                      <a:off x="0" y="0"/>
-                      <a:ext cx="3628120" cy="2574570"/>
-                    </a:xfrm>
-                    <a:prstGeom prst="rect">
-                      <a:avLst/>
-                    </a:prstGeom>
-                  </pic:spPr>
-                </pic:pic>
-              </a:graphicData>
-            </a:graphic>
-          </wp:inline>
-        </w:drawing>
-      </w:r>
-    </w:p>
-    <w:p>
-      <w:pPr>
-        <w:rPr>
-          <w:rFonts w:ascii="Times New Roman" w:hAnsi="Times New Roman" w:cs="Times New Roman"/>
-        </w:rPr>
-      </w:pPr>
-      <w:r>
-        <w:rPr>
-          <w:rFonts w:ascii="Times New Roman" w:hAnsi="Times New Roman" w:cs="Times New Roman"/>
-        </w:rPr>
-        <w:t xml:space="preserve">Emitter resistors must be rated for the amount of current (power) flowing through them. 0805 resistors are not rated for this much power. If one resistor is not enough, you can parallel multiple resistors to share the current flow but make sure the equivalent resistance is equal to 4.7 ohms. </w:t>
-      </w:r>
-      <w:r>
-        <w:rPr>
-          <w:rFonts w:ascii="Times New Roman" w:hAnsi="Times New Roman" w:cs="Times New Roman"/>
-        </w:rPr>
-        <w:t>Might want to l</w:t>
-      </w:r>
-      <w:r>
-        <w:rPr>
-          <w:rFonts w:ascii="Times New Roman" w:hAnsi="Times New Roman" w:cs="Times New Roman"/>
-        </w:rPr>
-        <w:t>ook into these type of resistors:</w:t>
-      </w:r>
-      <w:r>
-        <w:rPr>
-          <w:rFonts w:ascii="Times New Roman" w:hAnsi="Times New Roman" w:cs="Times New Roman"/>
-        </w:rPr>
-        <w:br/>
-      </w:r>
-      <w:r>
-        <w:rPr>
-          <w:rFonts w:ascii="Times New Roman" w:hAnsi="Times New Roman" w:cs="Times New Roman"/>
-        </w:rPr>
-        <w:drawing>
-          <wp:inline distT="0" distB="0" distL="0" distR="0" wp14:anchorId="43B67D3F" wp14:editId="19244EBD">
-            <wp:extent cx="4267200" cy="1864165"/>
-            <wp:effectExtent l="0" t="0" r="0" b="3175"/>
-            <wp:docPr id="1974609777" name="Picture 1"/>
-            <wp:cNvGraphicFramePr>
-              <a:graphicFrameLocks xmlns:a="http://schemas.openxmlformats.org/drawingml/2006/main" noChangeAspect="1"/>
-            </wp:cNvGraphicFramePr>
-            <a:graphic xmlns:a="http://schemas.openxmlformats.org/drawingml/2006/main">
-              <a:graphicData uri="http://schemas.openxmlformats.org/drawingml/2006/picture">
-                <pic:pic xmlns:pic="http://schemas.openxmlformats.org/drawingml/2006/picture">
-                  <pic:nvPicPr>
-                    <pic:cNvPr id="1974609777" name=""/>
-                    <pic:cNvPicPr/>
-                  </pic:nvPicPr>
-                  <pic:blipFill>
-                    <a:blip r:embed="rId16"/>
-                    <a:stretch>
-                      <a:fillRect/>
-                    </a:stretch>
-                  </pic:blipFill>
-                  <pic:spPr>
-                    <a:xfrm>
-                      <a:off x="0" y="0"/>
-                      <a:ext cx="4277693" cy="1868749"/>
-                    </a:xfrm>
-                    <a:prstGeom prst="rect">
-                      <a:avLst/>
-                    </a:prstGeom>
-                  </pic:spPr>
-                </pic:pic>
-              </a:graphicData>
-            </a:graphic>
-          </wp:inline>
-        </w:drawing>
-      </w:r>
-    </w:p>
-    <w:p>
-      <w:pPr>
-        <w:rPr>
-          <w:rFonts w:ascii="Times New Roman" w:hAnsi="Times New Roman" w:cs="Times New Roman"/>
-        </w:rPr>
-      </w:pPr>
-      <w:hyperlink r:id="rId17" w:history="1">
-        <w:r>
-          <w:rPr>
-            <w:rStyle w:val="Hyperlink"/>
-            <w:rFonts w:ascii="Times New Roman" w:hAnsi="Times New Roman" w:cs="Times New Roman"/>
-          </w:rPr>
-          <w:t>https://www.digikey.com/en/products/detail/ohmite/45F700E/822514?gclsrc=aw.ds&amp;gad_source=1&amp;gad_campaignid=20232005509&amp;gbraid=0AAAAADrbLliuHNP6spSKVBbpgQ8634uKV&amp;gclid=CjwKCAjwjtTNBhB0EiwAuswYhjFWZgdJ4r9vpkrsfmZ7SnXZ2DlN_uV_YXcUEj7aXXJzm6rcLXk4XhoCIrgQAvD_BwE</w:t>
-        </w:r>
-      </w:hyperlink>
-    </w:p>
-    <w:p>
-      <w:pPr>
-        <w:rPr>
-          <w:rFonts w:ascii="Times New Roman" w:hAnsi="Times New Roman" w:cs="Times New Roman"/>
-        </w:rPr>
-      </w:pPr>
-    </w:p>
-    <w:p>
-      <w:pPr>
-        <w:rPr>
-          <w:rFonts w:ascii="Times New Roman" w:hAnsi="Times New Roman" w:cs="Times New Roman"/>
-        </w:rPr>
-      </w:pPr>
-    </w:p>
-    <w:p>
-      <w:pPr>
-        <w:rPr>
-          <w:rFonts w:ascii="Times New Roman" w:hAnsi="Times New Roman" w:cs="Times New Roman"/>
-        </w:rPr>
-      </w:pPr>
-    </w:p>
-    <w:p>
-      <w:pPr>
-        <w:rPr>
-          <w:rFonts w:ascii="Times New Roman" w:hAnsi="Times New Roman" w:cs="Times New Roman"/>
-        </w:rPr>
-      </w:pPr>
-    </w:p>
-    <w:p>
-      <w:pPr>
-        <w:rPr>
-          <w:rFonts w:ascii="Times New Roman" w:hAnsi="Times New Roman" w:cs="Times New Roman"/>
-        </w:rPr>
-      </w:pPr>
-    </w:p>
-    <w:p>
-      <w:pPr>
-        <w:rPr>
-          <w:rFonts w:ascii="Times New Roman" w:hAnsi="Times New Roman" w:cs="Times New Roman"/>
         </w:rPr>
       </w:pPr>
       <w:r>
@@ -716,7 +525,7 @@
                 <wp:cNvGraphicFramePr/>
                 <a:graphic xmlns:a="http://schemas.openxmlformats.org/drawingml/2006/main">
                   <a:graphicData uri="http://schemas.microsoft.com/office/word/2010/wordprocessingInk">
-                    <w14:contentPart bwMode="auto" r:id="rId18">
+                    <w14:contentPart bwMode="auto" r:id="rId15">
                       <w14:nvContentPartPr>
                         <w14:cNvContentPartPr/>
                       </w14:nvContentPartPr>
@@ -834,6 +643,7 @@
       <w:r>
         <w:rPr>
           <w:rFonts w:ascii="Times New Roman" w:hAnsi="Times New Roman" w:cs="Times New Roman"/>
+          <w:noProof/>
         </w:rPr>
         <w:drawing>
           <wp:inline distT="0" distB="0" distL="0" distR="0" wp14:anchorId="644C9609" wp14:editId="25C07E56">

</xml_diff>